<commit_message>
Update onboarding guide to use curl Claude Code installer
Remove Node.js install section and npm troubleshooting; replace with
single curl one-liner. Renumber affected sections (1.5–1.8 → 1.4–1.7).

Co-Authored-By: Claude Sonnet 4.6 <noreply@anthropic.com>
</commit_message>
<xml_diff>
--- a/Reactome_CuratorWorkflows_ClaudeCode_Guide_v1_3.docx
+++ b/Reactome_CuratorWorkflows_ClaudeCode_Guide_v1_3.docx
@@ -703,43 +703,6 @@
         <w:t>git config --global user.email "your@email.com"</w:t>
       </w:r>
     </w:p>
-    <w:p>
-      <w:pPr>
-        <w:pStyle w:val="Heading2"/>
-      </w:pPr>
-      <w:r>
-        <w:rPr>
-          <w:b/>
-          <w:color w:val="1F7A8C"/>
-          <w:sz w:val="22"/>
-        </w:rPr>
-        <w:t>1.4  Install Node.js</w:t>
-      </w:r>
-    </w:p>
-    <w:p>
-      <w:pPr/>
-      <w:r>
-        <w:rPr>
-          <w:sz w:val="20"/>
-        </w:rPr>
-        <w:t>Claude Code requires Node.js version 18 or higher. Check whether it is already installed and at the right version:</w:t>
-      </w:r>
-    </w:p>
-    <w:p>
-      <w:pPr>
-        <w:spacing w:before="80" w:after="80"/>
-        <w:ind w:left="432"/>
-        <w:shd w:val="clear" w:color="auto" w:fill="F2F2F2"/>
-      </w:pPr>
-      <w:r>
-        <w:rPr>
-          <w:rFonts w:ascii="Courier New" w:hAnsi="Courier New"/>
-          <w:color w:val="1A1A6C"/>
-          <w:sz w:val="18"/>
-        </w:rPr>
-        <w:t>node --version</w:t>
-      </w:r>
-    </w:p>
     <w:tbl>
       <w:tblPr>
         <w:tblStyle w:val="TableGrid"/>
@@ -878,128 +841,6 @@
       </w:tr>
     </w:tbl>
     <w:p>
-      <w:pPr/>
-    </w:p>
-    <w:p>
-      <w:pPr/>
-      <w:r>
-        <w:rPr>
-          <w:sz w:val="20"/>
-        </w:rPr>
-        <w:t>To install or update Node.js:</w:t>
-      </w:r>
-    </w:p>
-    <w:p>
-      <w:pPr>
-        <w:pStyle w:val="ListBullet"/>
-        <w:ind w:left="360"/>
-      </w:pPr>
-      <w:r>
-        <w:rPr>
-          <w:sz w:val="20"/>
-        </w:rPr>
-        <w:t>Go to https://nodejs.org</w:t>
-      </w:r>
-    </w:p>
-    <w:p>
-      <w:pPr>
-        <w:pStyle w:val="ListBullet"/>
-        <w:ind w:left="360"/>
-      </w:pPr>
-      <w:r>
-        <w:rPr>
-          <w:sz w:val="20"/>
-        </w:rPr>
-        <w:t>Click the button labeled LTS (Long Term Support)</w:t>
-      </w:r>
-    </w:p>
-    <w:p>
-      <w:pPr>
-        <w:pStyle w:val="ListBullet"/>
-        <w:ind w:left="360"/>
-      </w:pPr>
-      <w:r>
-        <w:rPr>
-          <w:sz w:val="20"/>
-        </w:rPr>
-        <w:t>This downloads a .pkg file to your Downloads folder</w:t>
-      </w:r>
-    </w:p>
-    <w:p>
-      <w:pPr>
-        <w:pStyle w:val="ListBullet"/>
-        <w:ind w:left="360"/>
-      </w:pPr>
-      <w:r>
-        <w:rPr>
-          <w:sz w:val="20"/>
-        </w:rPr>
-        <w:t>Open your Downloads folder and double-click the .pkg file</w:t>
-      </w:r>
-    </w:p>
-    <w:p>
-      <w:pPr>
-        <w:pStyle w:val="ListBullet"/>
-        <w:ind w:left="360"/>
-      </w:pPr>
-      <w:r>
-        <w:rPr>
-          <w:sz w:val="20"/>
-        </w:rPr>
-        <w:t>Click through the installer: Continue → Agree → Install. Enter your Mac password when prompted.</w:t>
-      </w:r>
-    </w:p>
-    <w:p>
-      <w:pPr>
-        <w:pStyle w:val="ListBullet"/>
-        <w:ind w:left="360"/>
-      </w:pPr>
-      <w:r>
-        <w:rPr>
-          <w:sz w:val="20"/>
-        </w:rPr>
-        <w:t>Click Close when it finishes</w:t>
-      </w:r>
-    </w:p>
-    <w:p>
-      <w:pPr>
-        <w:pStyle w:val="ListBullet"/>
-        <w:ind w:left="360"/>
-      </w:pPr>
-      <w:r>
-        <w:rPr>
-          <w:sz w:val="20"/>
-        </w:rPr>
-        <w:t>Open a new Terminal window (important — existing windows will not see the update) and verify:</w:t>
-      </w:r>
-    </w:p>
-    <w:p>
-      <w:pPr>
-        <w:spacing w:before="80" w:after="80"/>
-        <w:ind w:left="432"/>
-        <w:shd w:val="clear" w:color="auto" w:fill="F2F2F2"/>
-      </w:pPr>
-      <w:r>
-        <w:rPr>
-          <w:rFonts w:ascii="Courier New" w:hAnsi="Courier New"/>
-          <w:color w:val="1A1A6C"/>
-          <w:sz w:val="18"/>
-        </w:rPr>
-        <w:t>node --version</w:t>
-        <w:br/>
-        <w:t>npm --version</w:t>
-      </w:r>
-    </w:p>
-    <w:p>
-      <w:pPr/>
-      <w:r>
-        <w:rPr>
-          <w:sz w:val="20"/>
-        </w:rPr>
-        <w:t>Both should return version numbers. Node should be v18 or higher.</w:t>
-      </w:r>
-    </w:p>
-    <w:p>
       <w:pPr>
         <w:pStyle w:val="Heading2"/>
       </w:pPr>
@@ -1009,86 +850,13 @@
           <w:color w:val="1F7A8C"/>
           <w:sz w:val="22"/>
         </w:rPr>
-        <w:t>1.5  Install Claude Code</w:t>
+        <w:t>1.4  Install Claude Code</w:t>
       </w:r>
     </w:p>
     <w:p>
       <w:pPr/>
       <w:r>
-        <w:rPr>
-          <w:sz w:val="20"/>
-        </w:rPr>
-        <w:t>With Node.js installed, run:</w:t>
-      </w:r>
-    </w:p>
-    <w:p>
-      <w:pPr>
-        <w:spacing w:before="80" w:after="80"/>
-        <w:ind w:left="432"/>
-        <w:shd w:val="clear" w:color="auto" w:fill="F2F2F2"/>
-      </w:pPr>
-      <w:r>
-        <w:rPr>
-          <w:rFonts w:ascii="Courier New" w:hAnsi="Courier New"/>
-          <w:color w:val="1A1A6C"/>
-          <w:sz w:val="18"/>
-        </w:rPr>
-        <w:t>npm install -g @anthropic-ai/claude-code</w:t>
-      </w:r>
-    </w:p>
-    <w:p>
-      <w:r>
-        <w:rPr>
-          <w:b/>
-          <w:sz w:val="20"/>
-        </w:rPr>
-        <w:t>If you see a permissions error (EACCES)</w:t>
-      </w:r>
-    </w:p>
-    <w:p>
-      <w:pPr/>
-      <w:r>
-        <w:rPr>
-          <w:sz w:val="20"/>
-        </w:rPr>
-        <w:t>On macOS, npm may not have permission to write to /usr/local/lib/node_modules/. Fix by redirecting global npm packages to your home directory. Run these five commands in order:</w:t>
-      </w:r>
-    </w:p>
-    <w:p>
-      <w:pPr>
-        <w:spacing w:before="80" w:after="80"/>
-        <w:ind w:left="432"/>
-        <w:shd w:val="clear" w:color="auto" w:fill="F2F2F2"/>
-      </w:pPr>
-      <w:r>
-        <w:rPr>
-          <w:rFonts w:ascii="Courier New" w:hAnsi="Courier New"/>
-          <w:color w:val="1A1A6C"/>
-          <w:sz w:val="18"/>
-        </w:rPr>
-        <w:t>mkdir -p ~/.npm-global</w:t>
-        <w:br/>
-        <w:t>npm config set prefix '~/.npm-global'</w:t>
-        <w:br/>
-        <w:t>echo 'export PATH=~/.npm-global/bin:$PATH' &gt;&gt; ~/.zshrc</w:t>
-        <w:br/>
-        <w:t>source ~/.zshrc</w:t>
-        <w:br/>
-        <w:t>npm install -g @anthropic-ai/claude-code</w:t>
-      </w:r>
-    </w:p>
-    <w:p>
-      <w:pPr>
-        <w:spacing w:before="80" w:after="80"/>
-        <w:ind w:left="432"/>
-      </w:pPr>
-      <w:r>
-        <w:rPr>
-          <w:i/>
-          <w:color w:val="444444"/>
-          <w:sz w:val="18"/>
-        </w:rPr>
-        <w:t>This permissions fix only needs to be done once.</w:t>
+        <w:t xml:space="preserve">curl -fsSL https://claude.ai/install.sh | bash</w:t>
       </w:r>
     </w:p>
     <w:p>
@@ -1101,7 +869,7 @@
           <w:color w:val="1F7A8C"/>
           <w:sz w:val="22"/>
         </w:rPr>
-        <w:t>1.6  Set your Anthropic API key</w:t>
+        <w:t>1.5  Set your Anthropic API key</w:t>
       </w:r>
     </w:p>
     <w:p>
@@ -1149,7 +917,7 @@
           <w:color w:val="1F7A8C"/>
           <w:sz w:val="22"/>
         </w:rPr>
-        <w:t>1.7  Verify Claude Code is installed</w:t>
+        <w:t>1.6  Verify Claude Code is installed</w:t>
       </w:r>
     </w:p>
     <w:p>
@@ -1186,7 +954,7 @@
           <w:color w:val="1F7A8C"/>
           <w:sz w:val="22"/>
         </w:rPr>
-        <w:t>1.8  Install Python dependencies</w:t>
+        <w:t>1.7  Install Python dependencies</w:t>
       </w:r>
     </w:p>
     <w:p>

</xml_diff>